<commit_message>
Upload finally 8 semester ETITC
</commit_message>
<xml_diff>
--- a/ENFASIS 1 SEGURIDAD DE LA INFORMACION/Laboratorio Anderson Aza y Sebastian Rodriguez.docx
+++ b/ENFASIS 1 SEGURIDAD DE LA INFORMACION/Laboratorio Anderson Aza y Sebastian Rodriguez.docx
@@ -1407,6 +1407,7 @@
       <w:r>
         <w:rPr>
           <w:rFonts w:ascii="Arial" w:hAnsi="Arial" w:cs="Arial"/>
+          <w:noProof/>
           <w:sz w:val="24"/>
           <w:szCs w:val="24"/>
           <w:lang w:val="es-ES"/>
@@ -1763,6 +1764,7 @@
       <w:r>
         <w:rPr>
           <w:rFonts w:ascii="Arial" w:hAnsi="Arial" w:cs="Arial"/>
+          <w:noProof/>
           <w:sz w:val="24"/>
           <w:szCs w:val="24"/>
           <w:lang w:val="es-ES"/>
@@ -1886,6 +1888,7 @@
       <w:r>
         <w:rPr>
           <w:rFonts w:ascii="Arial" w:hAnsi="Arial" w:cs="Arial"/>
+          <w:noProof/>
           <w:sz w:val="24"/>
           <w:szCs w:val="24"/>
           <w:lang w:val="es-ES"/>
@@ -2008,25 +2011,7 @@
           <w:szCs w:val="24"/>
           <w:lang w:val="es-ES"/>
         </w:rPr>
-        <w:t xml:space="preserve"> </w:t>
-      </w:r>
-      <w:r>
-        <w:rPr>
-          <w:rFonts w:ascii="Arial" w:hAnsi="Arial" w:cs="Arial"/>
-          <w:sz w:val="24"/>
-          <w:szCs w:val="24"/>
-          <w:lang w:val="es-ES"/>
-        </w:rPr>
-        <w:t xml:space="preserve">-d </w:t>
-      </w:r>
-      <w:r>
-        <w:rPr>
-          <w:rFonts w:ascii="Arial" w:hAnsi="Arial" w:cs="Arial"/>
-          <w:sz w:val="24"/>
-          <w:szCs w:val="24"/>
-          <w:lang w:val="es-ES"/>
-        </w:rPr>
-        <w:t>-aes-128-cbc -a -</w:t>
+        <w:t xml:space="preserve"> -d -aes-128-cbc -a -</w:t>
       </w:r>
       <w:proofErr w:type="spellStart"/>
       <w:r>
@@ -2066,25 +2051,7 @@
           <w:szCs w:val="24"/>
           <w:lang w:val="es-ES"/>
         </w:rPr>
-        <w:t xml:space="preserve"> del archivo </w:t>
-      </w:r>
-      <w:r>
-        <w:rPr>
-          <w:rFonts w:ascii="Arial" w:hAnsi="Arial" w:cs="Arial"/>
-          <w:sz w:val="24"/>
-          <w:szCs w:val="24"/>
-          <w:lang w:val="es-ES"/>
-        </w:rPr>
-        <w:t xml:space="preserve">encriptado </w:t>
-      </w:r>
-      <w:r>
-        <w:rPr>
-          <w:rFonts w:ascii="Arial" w:hAnsi="Arial" w:cs="Arial"/>
-          <w:sz w:val="24"/>
-          <w:szCs w:val="24"/>
-          <w:lang w:val="es-ES"/>
-        </w:rPr>
-        <w:t>-</w:t>
+        <w:t xml:space="preserve"> del archivo encriptado -</w:t>
       </w:r>
       <w:proofErr w:type="spellStart"/>
       <w:r>
@@ -2104,30 +2071,22 @@
           <w:szCs w:val="24"/>
           <w:lang w:val="es-ES"/>
         </w:rPr>
-        <w:t xml:space="preserve"> nombre del archivo que creara con el texto plano </w:t>
-      </w:r>
-      <w:r>
-        <w:rPr>
-          <w:rFonts w:ascii="Arial" w:hAnsi="Arial" w:cs="Arial"/>
-          <w:sz w:val="24"/>
-          <w:szCs w:val="24"/>
-          <w:lang w:val="es-ES"/>
-        </w:rPr>
-        <w:t>desencriptado</w:t>
-      </w:r>
-    </w:p>
-    <w:p>
-      <w:pPr>
-        <w:rPr>
-          <w:rFonts w:ascii="Arial" w:hAnsi="Arial" w:cs="Arial"/>
-          <w:sz w:val="24"/>
-          <w:szCs w:val="24"/>
-          <w:lang w:val="es-ES"/>
-        </w:rPr>
-      </w:pPr>
-      <w:r>
-        <w:rPr>
-          <w:rFonts w:ascii="Arial" w:hAnsi="Arial" w:cs="Arial"/>
+        <w:t xml:space="preserve"> nombre del archivo que creara con el texto plano desencriptado</w:t>
+      </w:r>
+    </w:p>
+    <w:p>
+      <w:pPr>
+        <w:rPr>
+          <w:rFonts w:ascii="Arial" w:hAnsi="Arial" w:cs="Arial"/>
+          <w:sz w:val="24"/>
+          <w:szCs w:val="24"/>
+          <w:lang w:val="es-ES"/>
+        </w:rPr>
+      </w:pPr>
+      <w:r>
+        <w:rPr>
+          <w:rFonts w:ascii="Arial" w:hAnsi="Arial" w:cs="Arial"/>
+          <w:noProof/>
           <w:sz w:val="24"/>
           <w:szCs w:val="24"/>
           <w:lang w:val="es-ES"/>
@@ -2205,6 +2164,7 @@
       <w:r>
         <w:rPr>
           <w:rFonts w:ascii="Arial" w:hAnsi="Arial" w:cs="Arial"/>
+          <w:noProof/>
           <w:sz w:val="24"/>
           <w:szCs w:val="24"/>
           <w:lang w:val="es-ES"/>
@@ -2315,6 +2275,7 @@
       <w:r>
         <w:rPr>
           <w:rFonts w:ascii="Arial" w:hAnsi="Arial" w:cs="Arial"/>
+          <w:noProof/>
           <w:sz w:val="24"/>
           <w:szCs w:val="24"/>
           <w:lang w:val="es-ES"/>
@@ -2356,6 +2317,1671 @@
         </w:drawing>
       </w:r>
     </w:p>
+    <w:p>
+      <w:pPr>
+        <w:rPr>
+          <w:rFonts w:ascii="Arial" w:hAnsi="Arial" w:cs="Arial"/>
+          <w:sz w:val="24"/>
+          <w:szCs w:val="24"/>
+          <w:lang w:val="es-ES"/>
+        </w:rPr>
+      </w:pPr>
+      <w:r>
+        <w:rPr>
+          <w:rFonts w:ascii="Arial" w:hAnsi="Arial" w:cs="Arial"/>
+          <w:sz w:val="24"/>
+          <w:szCs w:val="24"/>
+          <w:lang w:val="es-ES"/>
+        </w:rPr>
+        <w:br w:type="page"/>
+      </w:r>
+    </w:p>
+    <w:p>
+      <w:pPr>
+        <w:rPr>
+          <w:rFonts w:ascii="Arial" w:hAnsi="Arial" w:cs="Arial"/>
+          <w:sz w:val="24"/>
+          <w:szCs w:val="24"/>
+          <w:lang w:val="es-ES"/>
+        </w:rPr>
+      </w:pPr>
+      <w:r>
+        <w:rPr>
+          <w:rFonts w:ascii="Arial" w:hAnsi="Arial" w:cs="Arial"/>
+          <w:sz w:val="24"/>
+          <w:szCs w:val="24"/>
+          <w:lang w:val="es-ES"/>
+        </w:rPr>
+        <w:lastRenderedPageBreak/>
+        <w:t>INICIO LAB 2</w:t>
+      </w:r>
+    </w:p>
+    <w:p>
+      <w:pPr>
+        <w:pStyle w:val="Prrafodelista"/>
+        <w:numPr>
+          <w:ilvl w:val="0"/>
+          <w:numId w:val="1"/>
+        </w:numPr>
+        <w:rPr>
+          <w:rFonts w:ascii="Arial" w:hAnsi="Arial" w:cs="Arial"/>
+          <w:sz w:val="24"/>
+          <w:szCs w:val="24"/>
+          <w:lang w:val="es-ES"/>
+        </w:rPr>
+      </w:pPr>
+      <w:r>
+        <w:rPr>
+          <w:rFonts w:ascii="Arial" w:hAnsi="Arial" w:cs="Arial"/>
+          <w:sz w:val="24"/>
+          <w:szCs w:val="24"/>
+          <w:lang w:val="es-ES"/>
+        </w:rPr>
+        <w:t xml:space="preserve">Realizamos la instalación del paquete </w:t>
+      </w:r>
+      <w:proofErr w:type="spellStart"/>
+      <w:r>
+        <w:rPr>
+          <w:rFonts w:ascii="Arial" w:hAnsi="Arial" w:cs="Arial"/>
+          <w:sz w:val="24"/>
+          <w:szCs w:val="24"/>
+          <w:lang w:val="es-ES"/>
+        </w:rPr>
+        <w:t>StegHide</w:t>
+      </w:r>
+      <w:proofErr w:type="spellEnd"/>
+      <w:r>
+        <w:rPr>
+          <w:rFonts w:ascii="Arial" w:hAnsi="Arial" w:cs="Arial"/>
+          <w:sz w:val="24"/>
+          <w:szCs w:val="24"/>
+          <w:lang w:val="es-ES"/>
+        </w:rPr>
+        <w:t xml:space="preserve"> con el siguiente comando</w:t>
+      </w:r>
+      <w:r>
+        <w:rPr>
+          <w:rFonts w:ascii="Arial" w:hAnsi="Arial" w:cs="Arial"/>
+          <w:sz w:val="24"/>
+          <w:szCs w:val="24"/>
+          <w:lang w:val="es-ES"/>
+        </w:rPr>
+        <w:br/>
+      </w:r>
+      <w:r>
+        <w:rPr>
+          <w:rFonts w:ascii="Arial" w:hAnsi="Arial" w:cs="Arial"/>
+          <w:sz w:val="24"/>
+          <w:szCs w:val="24"/>
+          <w:lang w:val="es-ES"/>
+        </w:rPr>
+        <w:drawing>
+          <wp:inline distT="0" distB="0" distL="0" distR="0" wp14:anchorId="13E90CFF" wp14:editId="332AEC61">
+            <wp:extent cx="5612130" cy="3942715"/>
+            <wp:effectExtent l="0" t="0" r="7620" b="635"/>
+            <wp:docPr id="2" name="Imagen 2"/>
+            <wp:cNvGraphicFramePr>
+              <a:graphicFrameLocks xmlns:a="http://schemas.openxmlformats.org/drawingml/2006/main" noChangeAspect="1"/>
+            </wp:cNvGraphicFramePr>
+            <a:graphic xmlns:a="http://schemas.openxmlformats.org/drawingml/2006/main">
+              <a:graphicData uri="http://schemas.openxmlformats.org/drawingml/2006/picture">
+                <pic:pic xmlns:pic="http://schemas.openxmlformats.org/drawingml/2006/picture">
+                  <pic:nvPicPr>
+                    <pic:cNvPr id="1" name=""/>
+                    <pic:cNvPicPr/>
+                  </pic:nvPicPr>
+                  <pic:blipFill>
+                    <a:blip r:embed="rId15"/>
+                    <a:stretch>
+                      <a:fillRect/>
+                    </a:stretch>
+                  </pic:blipFill>
+                  <pic:spPr>
+                    <a:xfrm>
+                      <a:off x="0" y="0"/>
+                      <a:ext cx="5612130" cy="3942715"/>
+                    </a:xfrm>
+                    <a:prstGeom prst="rect">
+                      <a:avLst/>
+                    </a:prstGeom>
+                  </pic:spPr>
+                </pic:pic>
+              </a:graphicData>
+            </a:graphic>
+          </wp:inline>
+        </w:drawing>
+      </w:r>
+    </w:p>
+    <w:p>
+      <w:pPr>
+        <w:pStyle w:val="Prrafodelista"/>
+        <w:numPr>
+          <w:ilvl w:val="0"/>
+          <w:numId w:val="1"/>
+        </w:numPr>
+        <w:rPr>
+          <w:rFonts w:ascii="Arial" w:hAnsi="Arial" w:cs="Arial"/>
+          <w:sz w:val="24"/>
+          <w:szCs w:val="24"/>
+          <w:lang w:val="es-ES"/>
+        </w:rPr>
+      </w:pPr>
+      <w:r>
+        <w:rPr>
+          <w:rFonts w:ascii="Arial" w:hAnsi="Arial" w:cs="Arial"/>
+          <w:sz w:val="24"/>
+          <w:szCs w:val="24"/>
+          <w:lang w:val="es-ES"/>
+        </w:rPr>
+        <w:lastRenderedPageBreak/>
+        <w:t xml:space="preserve"> Verificamos la instalación del paquete con el comando </w:t>
+      </w:r>
+      <w:proofErr w:type="spellStart"/>
+      <w:r>
+        <w:rPr>
+          <w:rFonts w:ascii="Arial" w:hAnsi="Arial" w:cs="Arial"/>
+          <w:sz w:val="24"/>
+          <w:szCs w:val="24"/>
+          <w:lang w:val="es-ES"/>
+        </w:rPr>
+        <w:t>help</w:t>
+      </w:r>
+      <w:proofErr w:type="spellEnd"/>
+      <w:r>
+        <w:rPr>
+          <w:rFonts w:ascii="Arial" w:hAnsi="Arial" w:cs="Arial"/>
+          <w:sz w:val="24"/>
+          <w:szCs w:val="24"/>
+          <w:lang w:val="es-ES"/>
+        </w:rPr>
+        <w:t xml:space="preserve"> para ver todo lo que trae</w:t>
+      </w:r>
+      <w:r>
+        <w:rPr>
+          <w:rFonts w:ascii="Arial" w:hAnsi="Arial" w:cs="Arial"/>
+          <w:sz w:val="24"/>
+          <w:szCs w:val="24"/>
+          <w:lang w:val="es-ES"/>
+        </w:rPr>
+        <w:br/>
+      </w:r>
+      <w:r>
+        <w:rPr>
+          <w:lang w:val="es-ES"/>
+        </w:rPr>
+        <w:drawing>
+          <wp:inline distT="0" distB="0" distL="0" distR="0" wp14:anchorId="0DF2DD19" wp14:editId="313D4EDA">
+            <wp:extent cx="5612130" cy="5124450"/>
+            <wp:effectExtent l="0" t="0" r="7620" b="0"/>
+            <wp:docPr id="3" name="Imagen 3"/>
+            <wp:cNvGraphicFramePr>
+              <a:graphicFrameLocks xmlns:a="http://schemas.openxmlformats.org/drawingml/2006/main" noChangeAspect="1"/>
+            </wp:cNvGraphicFramePr>
+            <a:graphic xmlns:a="http://schemas.openxmlformats.org/drawingml/2006/main">
+              <a:graphicData uri="http://schemas.openxmlformats.org/drawingml/2006/picture">
+                <pic:pic xmlns:pic="http://schemas.openxmlformats.org/drawingml/2006/picture">
+                  <pic:nvPicPr>
+                    <pic:cNvPr id="1" name=""/>
+                    <pic:cNvPicPr/>
+                  </pic:nvPicPr>
+                  <pic:blipFill>
+                    <a:blip r:embed="rId16"/>
+                    <a:stretch>
+                      <a:fillRect/>
+                    </a:stretch>
+                  </pic:blipFill>
+                  <pic:spPr>
+                    <a:xfrm>
+                      <a:off x="0" y="0"/>
+                      <a:ext cx="5612130" cy="5124450"/>
+                    </a:xfrm>
+                    <a:prstGeom prst="rect">
+                      <a:avLst/>
+                    </a:prstGeom>
+                  </pic:spPr>
+                </pic:pic>
+              </a:graphicData>
+            </a:graphic>
+          </wp:inline>
+        </w:drawing>
+      </w:r>
+    </w:p>
+    <w:p>
+      <w:pPr>
+        <w:pStyle w:val="Prrafodelista"/>
+        <w:numPr>
+          <w:ilvl w:val="0"/>
+          <w:numId w:val="1"/>
+        </w:numPr>
+        <w:rPr>
+          <w:rFonts w:ascii="Arial" w:hAnsi="Arial" w:cs="Arial"/>
+          <w:sz w:val="24"/>
+          <w:szCs w:val="24"/>
+          <w:lang w:val="es-ES"/>
+        </w:rPr>
+      </w:pPr>
+      <w:r>
+        <w:rPr>
+          <w:rFonts w:ascii="Arial" w:hAnsi="Arial" w:cs="Arial"/>
+          <w:sz w:val="24"/>
+          <w:szCs w:val="24"/>
+          <w:lang w:val="es-ES"/>
+        </w:rPr>
+        <w:lastRenderedPageBreak/>
+        <w:t xml:space="preserve"> Descargamos la imagen que utilizaremos para la esteganografía en nuestro caso la llamamos </w:t>
+      </w:r>
+      <w:proofErr w:type="spellStart"/>
+      <w:r>
+        <w:rPr>
+          <w:rFonts w:ascii="Arial" w:hAnsi="Arial" w:cs="Arial"/>
+          <w:sz w:val="24"/>
+          <w:szCs w:val="24"/>
+          <w:lang w:val="es-ES"/>
+        </w:rPr>
+        <w:t>Image.Jpg</w:t>
+      </w:r>
+      <w:proofErr w:type="spellEnd"/>
+      <w:r>
+        <w:rPr>
+          <w:rFonts w:ascii="Arial" w:hAnsi="Arial" w:cs="Arial"/>
+          <w:sz w:val="24"/>
+          <w:szCs w:val="24"/>
+          <w:lang w:val="es-ES"/>
+        </w:rPr>
+        <w:br/>
+      </w:r>
+      <w:r>
+        <w:rPr>
+          <w:lang w:val="es-ES"/>
+        </w:rPr>
+        <w:drawing>
+          <wp:inline distT="0" distB="0" distL="0" distR="0" wp14:anchorId="57D03C4B" wp14:editId="725CD571">
+            <wp:extent cx="5612130" cy="2961005"/>
+            <wp:effectExtent l="0" t="0" r="7620" b="0"/>
+            <wp:docPr id="16" name="Imagen 16"/>
+            <wp:cNvGraphicFramePr>
+              <a:graphicFrameLocks xmlns:a="http://schemas.openxmlformats.org/drawingml/2006/main" noChangeAspect="1"/>
+            </wp:cNvGraphicFramePr>
+            <a:graphic xmlns:a="http://schemas.openxmlformats.org/drawingml/2006/main">
+              <a:graphicData uri="http://schemas.openxmlformats.org/drawingml/2006/picture">
+                <pic:pic xmlns:pic="http://schemas.openxmlformats.org/drawingml/2006/picture">
+                  <pic:nvPicPr>
+                    <pic:cNvPr id="1" name=""/>
+                    <pic:cNvPicPr/>
+                  </pic:nvPicPr>
+                  <pic:blipFill>
+                    <a:blip r:embed="rId17"/>
+                    <a:stretch>
+                      <a:fillRect/>
+                    </a:stretch>
+                  </pic:blipFill>
+                  <pic:spPr>
+                    <a:xfrm>
+                      <a:off x="0" y="0"/>
+                      <a:ext cx="5612130" cy="2961005"/>
+                    </a:xfrm>
+                    <a:prstGeom prst="rect">
+                      <a:avLst/>
+                    </a:prstGeom>
+                  </pic:spPr>
+                </pic:pic>
+              </a:graphicData>
+            </a:graphic>
+          </wp:inline>
+        </w:drawing>
+      </w:r>
+    </w:p>
+    <w:p>
+      <w:pPr>
+        <w:pStyle w:val="Prrafodelista"/>
+        <w:numPr>
+          <w:ilvl w:val="0"/>
+          <w:numId w:val="1"/>
+        </w:numPr>
+        <w:rPr>
+          <w:rFonts w:ascii="Arial" w:hAnsi="Arial" w:cs="Arial"/>
+          <w:sz w:val="24"/>
+          <w:szCs w:val="24"/>
+          <w:lang w:val="es-ES"/>
+        </w:rPr>
+      </w:pPr>
+      <w:r>
+        <w:rPr>
+          <w:rFonts w:ascii="Arial" w:hAnsi="Arial" w:cs="Arial"/>
+          <w:sz w:val="24"/>
+          <w:szCs w:val="24"/>
+          <w:lang w:val="es-ES"/>
+        </w:rPr>
+        <w:t xml:space="preserve">Utilizamos el siguiente comando para enlazar el archivo de texto encriptado con la autoevaluación y la imagen con esto ya tendríamos la encriptación y la esteganografía  </w:t>
+      </w:r>
+      <w:r>
+        <w:rPr>
+          <w:rFonts w:ascii="Arial" w:hAnsi="Arial" w:cs="Arial"/>
+          <w:sz w:val="24"/>
+          <w:szCs w:val="24"/>
+          <w:lang w:val="es-ES"/>
+        </w:rPr>
+        <w:br/>
+      </w:r>
+      <w:r>
+        <w:rPr>
+          <w:lang w:val="es-ES"/>
+        </w:rPr>
+        <w:drawing>
+          <wp:inline distT="0" distB="0" distL="0" distR="0" wp14:anchorId="2244CFE2" wp14:editId="49E25B0B">
+            <wp:extent cx="5612130" cy="755650"/>
+            <wp:effectExtent l="0" t="0" r="7620" b="6350"/>
+            <wp:docPr id="13" name="Imagen 13"/>
+            <wp:cNvGraphicFramePr>
+              <a:graphicFrameLocks xmlns:a="http://schemas.openxmlformats.org/drawingml/2006/main" noChangeAspect="1"/>
+            </wp:cNvGraphicFramePr>
+            <a:graphic xmlns:a="http://schemas.openxmlformats.org/drawingml/2006/main">
+              <a:graphicData uri="http://schemas.openxmlformats.org/drawingml/2006/picture">
+                <pic:pic xmlns:pic="http://schemas.openxmlformats.org/drawingml/2006/picture">
+                  <pic:nvPicPr>
+                    <pic:cNvPr id="1" name=""/>
+                    <pic:cNvPicPr/>
+                  </pic:nvPicPr>
+                  <pic:blipFill>
+                    <a:blip r:embed="rId18"/>
+                    <a:stretch>
+                      <a:fillRect/>
+                    </a:stretch>
+                  </pic:blipFill>
+                  <pic:spPr>
+                    <a:xfrm>
+                      <a:off x="0" y="0"/>
+                      <a:ext cx="5612130" cy="755650"/>
+                    </a:xfrm>
+                    <a:prstGeom prst="rect">
+                      <a:avLst/>
+                    </a:prstGeom>
+                  </pic:spPr>
+                </pic:pic>
+              </a:graphicData>
+            </a:graphic>
+          </wp:inline>
+        </w:drawing>
+      </w:r>
+    </w:p>
+    <w:p>
+      <w:pPr>
+        <w:pStyle w:val="Prrafodelista"/>
+        <w:numPr>
+          <w:ilvl w:val="1"/>
+          <w:numId w:val="1"/>
+        </w:numPr>
+        <w:rPr>
+          <w:rFonts w:ascii="Arial" w:hAnsi="Arial" w:cs="Arial"/>
+          <w:sz w:val="24"/>
+          <w:szCs w:val="24"/>
+          <w:lang w:val="es-ES"/>
+        </w:rPr>
+      </w:pPr>
+      <w:proofErr w:type="spellStart"/>
+      <w:r>
+        <w:rPr>
+          <w:rFonts w:ascii="Arial" w:hAnsi="Arial" w:cs="Arial"/>
+          <w:sz w:val="24"/>
+          <w:szCs w:val="24"/>
+          <w:lang w:val="es-ES"/>
+        </w:rPr>
+        <w:t>steghide</w:t>
+      </w:r>
+      <w:proofErr w:type="spellEnd"/>
+      <w:r>
+        <w:rPr>
+          <w:rFonts w:ascii="Arial" w:hAnsi="Arial" w:cs="Arial"/>
+          <w:sz w:val="24"/>
+          <w:szCs w:val="24"/>
+          <w:lang w:val="es-ES"/>
+        </w:rPr>
+        <w:t xml:space="preserve">: Este es el nombre del programa o comando que estás ejecutando. Es el programa principal de </w:t>
+      </w:r>
+      <w:proofErr w:type="spellStart"/>
+      <w:r>
+        <w:rPr>
+          <w:rFonts w:ascii="Arial" w:hAnsi="Arial" w:cs="Arial"/>
+          <w:sz w:val="24"/>
+          <w:szCs w:val="24"/>
+          <w:lang w:val="es-ES"/>
+        </w:rPr>
+        <w:t>Steghide</w:t>
+      </w:r>
+      <w:proofErr w:type="spellEnd"/>
+      <w:r>
+        <w:rPr>
+          <w:rFonts w:ascii="Arial" w:hAnsi="Arial" w:cs="Arial"/>
+          <w:sz w:val="24"/>
+          <w:szCs w:val="24"/>
+          <w:lang w:val="es-ES"/>
+        </w:rPr>
+        <w:t>, una herramienta de esteganografía que se utiliza para ocultar datos dentro de otros archivos, como imágenes.</w:t>
+      </w:r>
+    </w:p>
+    <w:p>
+      <w:pPr>
+        <w:pStyle w:val="Prrafodelista"/>
+        <w:numPr>
+          <w:ilvl w:val="1"/>
+          <w:numId w:val="1"/>
+        </w:numPr>
+        <w:rPr>
+          <w:rFonts w:ascii="Arial" w:hAnsi="Arial" w:cs="Arial"/>
+          <w:sz w:val="24"/>
+          <w:szCs w:val="24"/>
+          <w:lang w:val="es-ES"/>
+        </w:rPr>
+      </w:pPr>
+      <w:proofErr w:type="spellStart"/>
+      <w:r>
+        <w:rPr>
+          <w:rFonts w:ascii="Arial" w:hAnsi="Arial" w:cs="Arial"/>
+          <w:sz w:val="24"/>
+          <w:szCs w:val="24"/>
+          <w:lang w:val="es-ES"/>
+        </w:rPr>
+        <w:t>embed</w:t>
+      </w:r>
+      <w:proofErr w:type="spellEnd"/>
+      <w:r>
+        <w:rPr>
+          <w:rFonts w:ascii="Arial" w:hAnsi="Arial" w:cs="Arial"/>
+          <w:sz w:val="24"/>
+          <w:szCs w:val="24"/>
+          <w:lang w:val="es-ES"/>
+        </w:rPr>
+        <w:t xml:space="preserve">: Esta es una opción de </w:t>
+      </w:r>
+      <w:proofErr w:type="spellStart"/>
+      <w:r>
+        <w:rPr>
+          <w:rFonts w:ascii="Arial" w:hAnsi="Arial" w:cs="Arial"/>
+          <w:sz w:val="24"/>
+          <w:szCs w:val="24"/>
+          <w:lang w:val="es-ES"/>
+        </w:rPr>
+        <w:t>Steghide</w:t>
+      </w:r>
+      <w:proofErr w:type="spellEnd"/>
+      <w:r>
+        <w:rPr>
+          <w:rFonts w:ascii="Arial" w:hAnsi="Arial" w:cs="Arial"/>
+          <w:sz w:val="24"/>
+          <w:szCs w:val="24"/>
+          <w:lang w:val="es-ES"/>
+        </w:rPr>
+        <w:t xml:space="preserve"> que le indica al programa que quieres incrustar (ocultar) datos en una imagen. Es decir, estás "incrustando" un archivo dentro de otro.</w:t>
+      </w:r>
+    </w:p>
+    <w:p>
+      <w:pPr>
+        <w:pStyle w:val="Prrafodelista"/>
+        <w:numPr>
+          <w:ilvl w:val="1"/>
+          <w:numId w:val="1"/>
+        </w:numPr>
+        <w:rPr>
+          <w:rFonts w:ascii="Arial" w:hAnsi="Arial" w:cs="Arial"/>
+          <w:sz w:val="24"/>
+          <w:szCs w:val="24"/>
+          <w:lang w:val="es-ES"/>
+        </w:rPr>
+      </w:pPr>
+      <w:r>
+        <w:rPr>
+          <w:rFonts w:ascii="Arial" w:hAnsi="Arial" w:cs="Arial"/>
+          <w:sz w:val="24"/>
+          <w:szCs w:val="24"/>
+          <w:lang w:val="es-ES"/>
+        </w:rPr>
+        <w:t>-</w:t>
+      </w:r>
+      <w:proofErr w:type="spellStart"/>
+      <w:r>
+        <w:rPr>
+          <w:rFonts w:ascii="Arial" w:hAnsi="Arial" w:cs="Arial"/>
+          <w:sz w:val="24"/>
+          <w:szCs w:val="24"/>
+          <w:lang w:val="es-ES"/>
+        </w:rPr>
+        <w:t>ef</w:t>
+      </w:r>
+      <w:proofErr w:type="spellEnd"/>
+      <w:r>
+        <w:rPr>
+          <w:rFonts w:ascii="Arial" w:hAnsi="Arial" w:cs="Arial"/>
+          <w:sz w:val="24"/>
+          <w:szCs w:val="24"/>
+          <w:lang w:val="es-ES"/>
+        </w:rPr>
+        <w:t xml:space="preserve"> (archivo que se va a incrustar): Aquí, "-</w:t>
+      </w:r>
+      <w:proofErr w:type="spellStart"/>
+      <w:r>
+        <w:rPr>
+          <w:rFonts w:ascii="Arial" w:hAnsi="Arial" w:cs="Arial"/>
+          <w:sz w:val="24"/>
+          <w:szCs w:val="24"/>
+          <w:lang w:val="es-ES"/>
+        </w:rPr>
+        <w:t>ef</w:t>
+      </w:r>
+      <w:proofErr w:type="spellEnd"/>
+      <w:r>
+        <w:rPr>
+          <w:rFonts w:ascii="Arial" w:hAnsi="Arial" w:cs="Arial"/>
+          <w:sz w:val="24"/>
+          <w:szCs w:val="24"/>
+          <w:lang w:val="es-ES"/>
+        </w:rPr>
+        <w:t xml:space="preserve">" es una opción que le indica a </w:t>
+      </w:r>
+      <w:proofErr w:type="spellStart"/>
+      <w:r>
+        <w:rPr>
+          <w:rFonts w:ascii="Arial" w:hAnsi="Arial" w:cs="Arial"/>
+          <w:sz w:val="24"/>
+          <w:szCs w:val="24"/>
+          <w:lang w:val="es-ES"/>
+        </w:rPr>
+        <w:t>Steghide</w:t>
+      </w:r>
+      <w:proofErr w:type="spellEnd"/>
+      <w:r>
+        <w:rPr>
+          <w:rFonts w:ascii="Arial" w:hAnsi="Arial" w:cs="Arial"/>
+          <w:sz w:val="24"/>
+          <w:szCs w:val="24"/>
+          <w:lang w:val="es-ES"/>
+        </w:rPr>
+        <w:t xml:space="preserve"> que el siguiente argumento es el archivo que deseas incrustar. Debes reemplazar "(archivo que se va a incrustar)" con la ruta y el nombre del archivo que quieres ocultar dentro de la imagen. Por ejemplo, si estás ocultando un archivo llamado "documento.txt" que está en tu escritorio, escribirías algo así: "/ruta/al/documento.txt".</w:t>
+      </w:r>
+    </w:p>
+    <w:p>
+      <w:pPr>
+        <w:pStyle w:val="Prrafodelista"/>
+        <w:numPr>
+          <w:ilvl w:val="1"/>
+          <w:numId w:val="1"/>
+        </w:numPr>
+        <w:rPr>
+          <w:rFonts w:ascii="Arial" w:hAnsi="Arial" w:cs="Arial"/>
+          <w:sz w:val="24"/>
+          <w:szCs w:val="24"/>
+          <w:lang w:val="es-ES"/>
+        </w:rPr>
+      </w:pPr>
+      <w:r>
+        <w:rPr>
+          <w:rFonts w:ascii="Arial" w:hAnsi="Arial" w:cs="Arial"/>
+          <w:sz w:val="24"/>
+          <w:szCs w:val="24"/>
+          <w:lang w:val="es-ES"/>
+        </w:rPr>
+        <w:t>-</w:t>
+      </w:r>
+      <w:proofErr w:type="spellStart"/>
+      <w:r>
+        <w:rPr>
+          <w:rFonts w:ascii="Arial" w:hAnsi="Arial" w:cs="Arial"/>
+          <w:sz w:val="24"/>
+          <w:szCs w:val="24"/>
+          <w:lang w:val="es-ES"/>
+        </w:rPr>
+        <w:t>cf</w:t>
+      </w:r>
+      <w:proofErr w:type="spellEnd"/>
+      <w:r>
+        <w:rPr>
+          <w:rFonts w:ascii="Arial" w:hAnsi="Arial" w:cs="Arial"/>
+          <w:sz w:val="24"/>
+          <w:szCs w:val="24"/>
+          <w:lang w:val="es-ES"/>
+        </w:rPr>
+        <w:t xml:space="preserve"> (archivo de imagen): Similar al anterior, "-</w:t>
+      </w:r>
+      <w:proofErr w:type="spellStart"/>
+      <w:r>
+        <w:rPr>
+          <w:rFonts w:ascii="Arial" w:hAnsi="Arial" w:cs="Arial"/>
+          <w:sz w:val="24"/>
+          <w:szCs w:val="24"/>
+          <w:lang w:val="es-ES"/>
+        </w:rPr>
+        <w:t>cf</w:t>
+      </w:r>
+      <w:proofErr w:type="spellEnd"/>
+      <w:r>
+        <w:rPr>
+          <w:rFonts w:ascii="Arial" w:hAnsi="Arial" w:cs="Arial"/>
+          <w:sz w:val="24"/>
+          <w:szCs w:val="24"/>
+          <w:lang w:val="es-ES"/>
+        </w:rPr>
+        <w:t xml:space="preserve">" es una opción que indica que el siguiente argumento es el archivo de imagen en el que deseas ocultar los datos. Debes reemplazar "(archivo de imagen)" con la ruta y el nombre del archivo de imagen que deseas utilizar. Por ejemplo, si estás utilizando una imagen llamada "imagen.jpg" </w:t>
+      </w:r>
+      <w:r>
+        <w:rPr>
+          <w:rFonts w:ascii="Arial" w:hAnsi="Arial" w:cs="Arial"/>
+          <w:sz w:val="24"/>
+          <w:szCs w:val="24"/>
+          <w:lang w:val="es-ES"/>
+        </w:rPr>
+        <w:lastRenderedPageBreak/>
+        <w:t>que está en tu carpeta de imágenes, escribirías algo así: "/ruta/a/imagen.jpg".</w:t>
+      </w:r>
+    </w:p>
+    <w:p>
+      <w:pPr>
+        <w:pStyle w:val="Prrafodelista"/>
+        <w:numPr>
+          <w:ilvl w:val="0"/>
+          <w:numId w:val="1"/>
+        </w:numPr>
+        <w:rPr>
+          <w:rFonts w:ascii="Arial" w:hAnsi="Arial" w:cs="Arial"/>
+          <w:sz w:val="24"/>
+          <w:szCs w:val="24"/>
+          <w:lang w:val="es-ES"/>
+        </w:rPr>
+      </w:pPr>
+      <w:r>
+        <w:rPr>
+          <w:rFonts w:ascii="Arial" w:hAnsi="Arial" w:cs="Arial"/>
+          <w:sz w:val="24"/>
+          <w:szCs w:val="24"/>
+          <w:lang w:val="es-ES"/>
+        </w:rPr>
+        <w:t xml:space="preserve"> Creamos una carpeta para </w:t>
+      </w:r>
+      <w:r>
+        <w:rPr>
+          <w:rFonts w:ascii="Arial" w:hAnsi="Arial" w:cs="Arial"/>
+          <w:sz w:val="24"/>
+          <w:szCs w:val="24"/>
+          <w:lang w:val="es-ES"/>
+        </w:rPr>
+        <w:t xml:space="preserve">extraer el archivo de la imagen y después compararlo, en nuestro caso la llamamos </w:t>
+      </w:r>
+      <w:proofErr w:type="spellStart"/>
+      <w:r>
+        <w:rPr>
+          <w:rFonts w:ascii="Arial" w:hAnsi="Arial" w:cs="Arial"/>
+          <w:sz w:val="24"/>
+          <w:szCs w:val="24"/>
+          <w:lang w:val="es-ES"/>
+        </w:rPr>
+        <w:t>ImagenExtract</w:t>
+      </w:r>
+      <w:proofErr w:type="spellEnd"/>
+      <w:r>
+        <w:rPr>
+          <w:rFonts w:ascii="Arial" w:hAnsi="Arial" w:cs="Arial"/>
+          <w:sz w:val="24"/>
+          <w:szCs w:val="24"/>
+          <w:lang w:val="es-ES"/>
+        </w:rPr>
+        <w:t xml:space="preserve"> para generar el archivo encriptado ahí</w:t>
+      </w:r>
+      <w:r>
+        <w:rPr>
+          <w:rFonts w:ascii="Arial" w:hAnsi="Arial" w:cs="Arial"/>
+          <w:sz w:val="24"/>
+          <w:szCs w:val="24"/>
+          <w:lang w:val="es-ES"/>
+        </w:rPr>
+        <w:br/>
+      </w:r>
+      <w:r>
+        <w:rPr>
+          <w:lang w:val="es-ES"/>
+        </w:rPr>
+        <w:drawing>
+          <wp:inline distT="0" distB="0" distL="0" distR="0" wp14:anchorId="25B2CA88" wp14:editId="57107828">
+            <wp:extent cx="3635055" cy="1767993"/>
+            <wp:effectExtent l="0" t="0" r="3810" b="3810"/>
+            <wp:docPr id="14" name="Imagen 14"/>
+            <wp:cNvGraphicFramePr>
+              <a:graphicFrameLocks xmlns:a="http://schemas.openxmlformats.org/drawingml/2006/main" noChangeAspect="1"/>
+            </wp:cNvGraphicFramePr>
+            <a:graphic xmlns:a="http://schemas.openxmlformats.org/drawingml/2006/main">
+              <a:graphicData uri="http://schemas.openxmlformats.org/drawingml/2006/picture">
+                <pic:pic xmlns:pic="http://schemas.openxmlformats.org/drawingml/2006/picture">
+                  <pic:nvPicPr>
+                    <pic:cNvPr id="1" name=""/>
+                    <pic:cNvPicPr/>
+                  </pic:nvPicPr>
+                  <pic:blipFill>
+                    <a:blip r:embed="rId19"/>
+                    <a:stretch>
+                      <a:fillRect/>
+                    </a:stretch>
+                  </pic:blipFill>
+                  <pic:spPr>
+                    <a:xfrm>
+                      <a:off x="0" y="0"/>
+                      <a:ext cx="3635055" cy="1767993"/>
+                    </a:xfrm>
+                    <a:prstGeom prst="rect">
+                      <a:avLst/>
+                    </a:prstGeom>
+                  </pic:spPr>
+                </pic:pic>
+              </a:graphicData>
+            </a:graphic>
+          </wp:inline>
+        </w:drawing>
+      </w:r>
+    </w:p>
+    <w:p>
+      <w:pPr>
+        <w:pStyle w:val="Prrafodelista"/>
+        <w:numPr>
+          <w:ilvl w:val="0"/>
+          <w:numId w:val="1"/>
+        </w:numPr>
+        <w:rPr>
+          <w:rFonts w:ascii="Arial" w:hAnsi="Arial" w:cs="Arial"/>
+          <w:sz w:val="24"/>
+          <w:szCs w:val="24"/>
+          <w:lang w:val="es-ES"/>
+        </w:rPr>
+      </w:pPr>
+      <w:r>
+        <w:rPr>
+          <w:rFonts w:ascii="Arial" w:hAnsi="Arial" w:cs="Arial"/>
+          <w:sz w:val="24"/>
+          <w:szCs w:val="24"/>
+          <w:lang w:val="es-ES"/>
+        </w:rPr>
+        <w:t xml:space="preserve"> Sacamos el Hash del archivo dentro de la carpeta </w:t>
+      </w:r>
+      <w:proofErr w:type="spellStart"/>
+      <w:r>
+        <w:rPr>
+          <w:rFonts w:ascii="Arial" w:hAnsi="Arial" w:cs="Arial"/>
+          <w:sz w:val="24"/>
+          <w:szCs w:val="24"/>
+          <w:lang w:val="es-ES"/>
+        </w:rPr>
+        <w:t>ImageExtract</w:t>
+      </w:r>
+      <w:proofErr w:type="spellEnd"/>
+      <w:r>
+        <w:rPr>
+          <w:rFonts w:ascii="Arial" w:hAnsi="Arial" w:cs="Arial"/>
+          <w:sz w:val="24"/>
+          <w:szCs w:val="24"/>
+          <w:lang w:val="es-ES"/>
+        </w:rPr>
+        <w:t xml:space="preserve"> y el archivo de </w:t>
+      </w:r>
+      <w:proofErr w:type="spellStart"/>
+      <w:r>
+        <w:rPr>
+          <w:rFonts w:ascii="Arial" w:hAnsi="Arial" w:cs="Arial"/>
+          <w:sz w:val="24"/>
+          <w:szCs w:val="24"/>
+          <w:lang w:val="es-ES"/>
+        </w:rPr>
+        <w:t>TextoEncriptado</w:t>
+      </w:r>
+      <w:proofErr w:type="spellEnd"/>
+      <w:r>
+        <w:rPr>
+          <w:rFonts w:ascii="Arial" w:hAnsi="Arial" w:cs="Arial"/>
+          <w:sz w:val="24"/>
+          <w:szCs w:val="24"/>
+          <w:lang w:val="es-ES"/>
+        </w:rPr>
+        <w:t xml:space="preserve"> del escritorio para compararlos y que sean iguales</w:t>
+      </w:r>
+      <w:r>
+        <w:rPr>
+          <w:rFonts w:ascii="Arial" w:hAnsi="Arial" w:cs="Arial"/>
+          <w:sz w:val="24"/>
+          <w:szCs w:val="24"/>
+          <w:lang w:val="es-ES"/>
+        </w:rPr>
+        <w:br/>
+      </w:r>
+      <w:r>
+        <w:rPr>
+          <w:lang w:val="es-ES"/>
+        </w:rPr>
+        <w:drawing>
+          <wp:inline distT="0" distB="0" distL="0" distR="0" wp14:anchorId="528E274C" wp14:editId="3286689A">
+            <wp:extent cx="4328535" cy="1889924"/>
+            <wp:effectExtent l="0" t="0" r="0" b="0"/>
+            <wp:docPr id="15" name="Imagen 15"/>
+            <wp:cNvGraphicFramePr>
+              <a:graphicFrameLocks xmlns:a="http://schemas.openxmlformats.org/drawingml/2006/main" noChangeAspect="1"/>
+            </wp:cNvGraphicFramePr>
+            <a:graphic xmlns:a="http://schemas.openxmlformats.org/drawingml/2006/main">
+              <a:graphicData uri="http://schemas.openxmlformats.org/drawingml/2006/picture">
+                <pic:pic xmlns:pic="http://schemas.openxmlformats.org/drawingml/2006/picture">
+                  <pic:nvPicPr>
+                    <pic:cNvPr id="1" name=""/>
+                    <pic:cNvPicPr/>
+                  </pic:nvPicPr>
+                  <pic:blipFill>
+                    <a:blip r:embed="rId20"/>
+                    <a:stretch>
+                      <a:fillRect/>
+                    </a:stretch>
+                  </pic:blipFill>
+                  <pic:spPr>
+                    <a:xfrm>
+                      <a:off x="0" y="0"/>
+                      <a:ext cx="4328535" cy="1889924"/>
+                    </a:xfrm>
+                    <a:prstGeom prst="rect">
+                      <a:avLst/>
+                    </a:prstGeom>
+                  </pic:spPr>
+                </pic:pic>
+              </a:graphicData>
+            </a:graphic>
+          </wp:inline>
+        </w:drawing>
+      </w:r>
+    </w:p>
+    <w:p>
+      <w:pPr>
+        <w:pStyle w:val="Prrafodelista"/>
+        <w:numPr>
+          <w:ilvl w:val="0"/>
+          <w:numId w:val="1"/>
+        </w:numPr>
+        <w:rPr>
+          <w:rFonts w:ascii="Arial" w:hAnsi="Arial" w:cs="Arial"/>
+          <w:sz w:val="24"/>
+          <w:szCs w:val="24"/>
+          <w:lang w:val="es-ES"/>
+        </w:rPr>
+      </w:pPr>
+      <w:r>
+        <w:rPr>
+          <w:rFonts w:ascii="Arial" w:hAnsi="Arial" w:cs="Arial"/>
+          <w:sz w:val="24"/>
+          <w:szCs w:val="24"/>
+          <w:lang w:val="es-ES"/>
+        </w:rPr>
+        <w:t>Buscar y explicar por qué método seria buen canal para transportar la imagen con</w:t>
+      </w:r>
+      <w:r>
+        <w:rPr>
+          <w:rFonts w:ascii="Arial" w:hAnsi="Arial" w:cs="Arial"/>
+          <w:sz w:val="24"/>
+          <w:szCs w:val="24"/>
+          <w:lang w:val="es-ES"/>
+        </w:rPr>
+        <w:t xml:space="preserve"> </w:t>
+      </w:r>
+      <w:r>
+        <w:rPr>
+          <w:rFonts w:ascii="Arial" w:hAnsi="Arial" w:cs="Arial"/>
+          <w:sz w:val="24"/>
+          <w:szCs w:val="24"/>
+          <w:lang w:val="es-ES"/>
+        </w:rPr>
+        <w:t>archivo encriptado</w:t>
+      </w:r>
+    </w:p>
+    <w:p>
+      <w:pPr>
+        <w:pStyle w:val="Prrafodelista"/>
+        <w:numPr>
+          <w:ilvl w:val="1"/>
+          <w:numId w:val="1"/>
+        </w:numPr>
+        <w:rPr>
+          <w:rFonts w:ascii="Arial" w:hAnsi="Arial" w:cs="Arial"/>
+          <w:sz w:val="24"/>
+          <w:szCs w:val="24"/>
+          <w:lang w:val="es-ES"/>
+        </w:rPr>
+      </w:pPr>
+      <w:r>
+        <w:rPr>
+          <w:rFonts w:ascii="Arial" w:hAnsi="Arial" w:cs="Arial"/>
+          <w:sz w:val="24"/>
+          <w:szCs w:val="24"/>
+          <w:lang w:val="es-ES"/>
+        </w:rPr>
+        <w:t>Correo electrónico seguro: El correo electrónico puede ser un canal conveniente para transportar datos ocultos utilizando esteganografía. Puedes incrustar el archivo encriptado dentro de una imagen y adjuntarla al correo electrónico. Sin embargo, debes tener en cuenta que los proveedores de correo electrónico a menudo escanean los archivos adjuntos en busca de malware, por lo que es posible que tu mensaje pueda ser detectado si la esteganografía no se realiza de manera adecuada.</w:t>
+      </w:r>
+    </w:p>
+    <w:p>
+      <w:pPr>
+        <w:pStyle w:val="Prrafodelista"/>
+        <w:numPr>
+          <w:ilvl w:val="1"/>
+          <w:numId w:val="1"/>
+        </w:numPr>
+        <w:rPr>
+          <w:rFonts w:ascii="Arial" w:hAnsi="Arial" w:cs="Arial"/>
+          <w:sz w:val="24"/>
+          <w:szCs w:val="24"/>
+          <w:lang w:val="es-ES"/>
+        </w:rPr>
+      </w:pPr>
+      <w:r>
+        <w:rPr>
+          <w:rFonts w:ascii="Arial" w:hAnsi="Arial" w:cs="Arial"/>
+          <w:sz w:val="24"/>
+          <w:szCs w:val="24"/>
+          <w:lang w:val="es-ES"/>
+        </w:rPr>
+        <w:t xml:space="preserve">Servicios de mensajería segura: Plataformas de mensajería segura, como </w:t>
+      </w:r>
+      <w:proofErr w:type="spellStart"/>
+      <w:r>
+        <w:rPr>
+          <w:rFonts w:ascii="Arial" w:hAnsi="Arial" w:cs="Arial"/>
+          <w:sz w:val="24"/>
+          <w:szCs w:val="24"/>
+          <w:lang w:val="es-ES"/>
+        </w:rPr>
+        <w:t>Signal</w:t>
+      </w:r>
+      <w:proofErr w:type="spellEnd"/>
+      <w:r>
+        <w:rPr>
+          <w:rFonts w:ascii="Arial" w:hAnsi="Arial" w:cs="Arial"/>
+          <w:sz w:val="24"/>
+          <w:szCs w:val="24"/>
+          <w:lang w:val="es-ES"/>
+        </w:rPr>
+        <w:t xml:space="preserve"> o WhatsApp con cifrado de extremo a extremo, pueden ser adecuadas para transportar datos ocultos. Al igual que con el correo electrónico, puedes enviar una imagen con el archivo encriptado incrustado. Sin embargo, debes asegurarte de que los servicios que utilices sean realmente seguros y protejan la privacidad de los datos.</w:t>
+      </w:r>
+    </w:p>
+    <w:p>
+      <w:pPr>
+        <w:pStyle w:val="Prrafodelista"/>
+        <w:numPr>
+          <w:ilvl w:val="1"/>
+          <w:numId w:val="1"/>
+        </w:numPr>
+        <w:rPr>
+          <w:rFonts w:ascii="Arial" w:hAnsi="Arial" w:cs="Arial"/>
+          <w:sz w:val="24"/>
+          <w:szCs w:val="24"/>
+          <w:lang w:val="es-ES"/>
+        </w:rPr>
+      </w:pPr>
+      <w:r>
+        <w:rPr>
+          <w:rFonts w:ascii="Arial" w:hAnsi="Arial" w:cs="Arial"/>
+          <w:sz w:val="24"/>
+          <w:szCs w:val="24"/>
+          <w:lang w:val="es-ES"/>
+        </w:rPr>
+        <w:lastRenderedPageBreak/>
+        <w:t>Almacenamiento en la nube cifrado: Puedes subir la imagen con el archivo encriptado a un servicio de almacenamiento en la nube que ofrezca cifrado de extremo a extremo. Esto puede proporcionar una capa adicional de seguridad para tus datos. Una vez que el archivo esté en la nube, puedes compartir el enlace de descarga con la persona destinataria de forma segura.</w:t>
+      </w:r>
+    </w:p>
+    <w:p>
+      <w:pPr>
+        <w:pStyle w:val="Prrafodelista"/>
+        <w:numPr>
+          <w:ilvl w:val="1"/>
+          <w:numId w:val="1"/>
+        </w:numPr>
+        <w:rPr>
+          <w:rFonts w:ascii="Arial" w:hAnsi="Arial" w:cs="Arial"/>
+          <w:sz w:val="24"/>
+          <w:szCs w:val="24"/>
+          <w:lang w:val="es-ES"/>
+        </w:rPr>
+      </w:pPr>
+      <w:r>
+        <w:rPr>
+          <w:rFonts w:ascii="Arial" w:hAnsi="Arial" w:cs="Arial"/>
+          <w:sz w:val="24"/>
+          <w:szCs w:val="24"/>
+          <w:lang w:val="es-ES"/>
+        </w:rPr>
+        <w:t>Transferencia directa mediante dispositivos de almacenamiento físico: Si estás preocupado por la seguridad en línea, puedes transportar la imagen con el archivo encriptado en un dispositivo de almacenamiento físico, como una unidad USB. Esto te permite entregar los datos directamente a la persona destinataria sin pasar por internet, lo que reduce el riesgo de intercepción.</w:t>
+      </w:r>
+    </w:p>
+    <w:p>
+      <w:pPr>
+        <w:pStyle w:val="Prrafodelista"/>
+        <w:numPr>
+          <w:ilvl w:val="0"/>
+          <w:numId w:val="1"/>
+        </w:numPr>
+        <w:rPr>
+          <w:rFonts w:ascii="Arial" w:hAnsi="Arial" w:cs="Arial"/>
+          <w:sz w:val="24"/>
+          <w:szCs w:val="24"/>
+          <w:lang w:val="es-ES"/>
+        </w:rPr>
+      </w:pPr>
+      <w:r>
+        <w:rPr>
+          <w:rFonts w:ascii="Arial" w:hAnsi="Arial" w:cs="Arial"/>
+          <w:sz w:val="24"/>
+          <w:szCs w:val="24"/>
+          <w:lang w:val="es-ES"/>
+        </w:rPr>
+        <w:t xml:space="preserve">Buscar y aplicar con </w:t>
+      </w:r>
+      <w:proofErr w:type="spellStart"/>
+      <w:r>
+        <w:rPr>
+          <w:rFonts w:ascii="Arial" w:hAnsi="Arial" w:cs="Arial"/>
+          <w:sz w:val="24"/>
+          <w:szCs w:val="24"/>
+          <w:lang w:val="es-ES"/>
+        </w:rPr>
+        <w:t>Steghide</w:t>
+      </w:r>
+      <w:proofErr w:type="spellEnd"/>
+      <w:r>
+        <w:rPr>
+          <w:rFonts w:ascii="Arial" w:hAnsi="Arial" w:cs="Arial"/>
+          <w:sz w:val="24"/>
+          <w:szCs w:val="24"/>
+          <w:lang w:val="es-ES"/>
+        </w:rPr>
+        <w:t xml:space="preserve"> como incrustar texto (no archivos ) en imágenes y aplicar</w:t>
+      </w:r>
+      <w:r>
+        <w:rPr>
+          <w:rFonts w:ascii="Arial" w:hAnsi="Arial" w:cs="Arial"/>
+          <w:sz w:val="24"/>
+          <w:szCs w:val="24"/>
+          <w:lang w:val="es-ES"/>
+        </w:rPr>
+        <w:t xml:space="preserve"> </w:t>
+      </w:r>
+      <w:proofErr w:type="spellStart"/>
+      <w:r>
+        <w:rPr>
+          <w:rFonts w:ascii="Arial" w:hAnsi="Arial" w:cs="Arial"/>
+          <w:sz w:val="24"/>
+          <w:szCs w:val="24"/>
+          <w:lang w:val="es-ES"/>
+        </w:rPr>
+        <w:t>hashing</w:t>
+      </w:r>
+      <w:proofErr w:type="spellEnd"/>
+      <w:r>
+        <w:rPr>
+          <w:rFonts w:ascii="Arial" w:hAnsi="Arial" w:cs="Arial"/>
+          <w:sz w:val="24"/>
+          <w:szCs w:val="24"/>
+          <w:lang w:val="es-ES"/>
+        </w:rPr>
+        <w:t xml:space="preserve"> y comparar con los hash </w:t>
+      </w:r>
+      <w:proofErr w:type="spellStart"/>
+      <w:r>
+        <w:rPr>
+          <w:rFonts w:ascii="Arial" w:hAnsi="Arial" w:cs="Arial"/>
+          <w:sz w:val="24"/>
+          <w:szCs w:val="24"/>
+          <w:lang w:val="es-ES"/>
+        </w:rPr>
+        <w:t>extraidos</w:t>
+      </w:r>
+      <w:proofErr w:type="spellEnd"/>
+      <w:r>
+        <w:rPr>
+          <w:rFonts w:ascii="Arial" w:hAnsi="Arial" w:cs="Arial"/>
+          <w:sz w:val="24"/>
+          <w:szCs w:val="24"/>
+          <w:lang w:val="es-ES"/>
+        </w:rPr>
+        <w:t xml:space="preserve"> anteriormente.</w:t>
+      </w:r>
+    </w:p>
+    <w:p>
+      <w:pPr>
+        <w:pStyle w:val="Prrafodelista"/>
+        <w:numPr>
+          <w:ilvl w:val="1"/>
+          <w:numId w:val="1"/>
+        </w:numPr>
+        <w:rPr>
+          <w:rFonts w:ascii="Arial" w:hAnsi="Arial" w:cs="Arial"/>
+          <w:sz w:val="24"/>
+          <w:szCs w:val="24"/>
+          <w:lang w:val="es-ES"/>
+        </w:rPr>
+      </w:pPr>
+      <w:r>
+        <w:rPr>
+          <w:rFonts w:ascii="Arial" w:hAnsi="Arial" w:cs="Arial"/>
+          <w:sz w:val="24"/>
+          <w:szCs w:val="24"/>
+          <w:lang w:val="es-ES"/>
+        </w:rPr>
+        <w:t>Preparación del texto y la imagen:</w:t>
+      </w:r>
+    </w:p>
+    <w:p>
+      <w:pPr>
+        <w:pStyle w:val="Prrafodelista"/>
+        <w:numPr>
+          <w:ilvl w:val="2"/>
+          <w:numId w:val="1"/>
+        </w:numPr>
+        <w:rPr>
+          <w:rFonts w:ascii="Arial" w:hAnsi="Arial" w:cs="Arial"/>
+          <w:sz w:val="24"/>
+          <w:szCs w:val="24"/>
+          <w:lang w:val="es-ES"/>
+        </w:rPr>
+      </w:pPr>
+      <w:r>
+        <w:rPr>
+          <w:rFonts w:ascii="Arial" w:hAnsi="Arial" w:cs="Arial"/>
+          <w:sz w:val="24"/>
+          <w:szCs w:val="24"/>
+          <w:lang w:val="es-ES"/>
+        </w:rPr>
+        <w:t>Prepara el texto que deseas incrustar en la imagen.</w:t>
+      </w:r>
+    </w:p>
+    <w:p>
+      <w:pPr>
+        <w:pStyle w:val="Prrafodelista"/>
+        <w:numPr>
+          <w:ilvl w:val="2"/>
+          <w:numId w:val="1"/>
+        </w:numPr>
+        <w:rPr>
+          <w:rFonts w:ascii="Arial" w:hAnsi="Arial" w:cs="Arial"/>
+          <w:sz w:val="24"/>
+          <w:szCs w:val="24"/>
+          <w:lang w:val="es-ES"/>
+        </w:rPr>
+      </w:pPr>
+      <w:r>
+        <w:rPr>
+          <w:rFonts w:ascii="Arial" w:hAnsi="Arial" w:cs="Arial"/>
+          <w:sz w:val="24"/>
+          <w:szCs w:val="24"/>
+          <w:lang w:val="es-ES"/>
+        </w:rPr>
+        <w:t>Elige una imagen en la que quieras incrustar el texto.</w:t>
+      </w:r>
+    </w:p>
+    <w:p>
+      <w:pPr>
+        <w:pStyle w:val="Prrafodelista"/>
+        <w:numPr>
+          <w:ilvl w:val="1"/>
+          <w:numId w:val="1"/>
+        </w:numPr>
+        <w:rPr>
+          <w:rFonts w:ascii="Arial" w:hAnsi="Arial" w:cs="Arial"/>
+          <w:sz w:val="24"/>
+          <w:szCs w:val="24"/>
+          <w:lang w:val="es-ES"/>
+        </w:rPr>
+      </w:pPr>
+      <w:r>
+        <w:rPr>
+          <w:rFonts w:ascii="Arial" w:hAnsi="Arial" w:cs="Arial"/>
+          <w:sz w:val="24"/>
+          <w:szCs w:val="24"/>
+          <w:lang w:val="es-ES"/>
+        </w:rPr>
+        <w:t xml:space="preserve">Incrustación del texto en la imagen con </w:t>
+      </w:r>
+      <w:proofErr w:type="spellStart"/>
+      <w:r>
+        <w:rPr>
+          <w:rFonts w:ascii="Arial" w:hAnsi="Arial" w:cs="Arial"/>
+          <w:sz w:val="24"/>
+          <w:szCs w:val="24"/>
+          <w:lang w:val="es-ES"/>
+        </w:rPr>
+        <w:t>Steghide</w:t>
+      </w:r>
+      <w:proofErr w:type="spellEnd"/>
+      <w:r>
+        <w:rPr>
+          <w:rFonts w:ascii="Arial" w:hAnsi="Arial" w:cs="Arial"/>
+          <w:sz w:val="24"/>
+          <w:szCs w:val="24"/>
+          <w:lang w:val="es-ES"/>
+        </w:rPr>
+        <w:t>:</w:t>
+      </w:r>
+    </w:p>
+    <w:p>
+      <w:pPr>
+        <w:pStyle w:val="Prrafodelista"/>
+        <w:numPr>
+          <w:ilvl w:val="2"/>
+          <w:numId w:val="1"/>
+        </w:numPr>
+        <w:rPr>
+          <w:rFonts w:ascii="Arial" w:hAnsi="Arial" w:cs="Arial"/>
+          <w:sz w:val="24"/>
+          <w:szCs w:val="24"/>
+          <w:lang w:val="es-ES"/>
+        </w:rPr>
+      </w:pPr>
+      <w:r>
+        <w:rPr>
+          <w:rFonts w:ascii="Arial" w:hAnsi="Arial" w:cs="Arial"/>
+          <w:sz w:val="24"/>
+          <w:szCs w:val="24"/>
+          <w:lang w:val="es-ES"/>
+        </w:rPr>
+        <w:t xml:space="preserve">Utiliza </w:t>
+      </w:r>
+      <w:proofErr w:type="spellStart"/>
+      <w:r>
+        <w:rPr>
+          <w:rFonts w:ascii="Arial" w:hAnsi="Arial" w:cs="Arial"/>
+          <w:sz w:val="24"/>
+          <w:szCs w:val="24"/>
+          <w:lang w:val="es-ES"/>
+        </w:rPr>
+        <w:t>Steghide</w:t>
+      </w:r>
+      <w:proofErr w:type="spellEnd"/>
+      <w:r>
+        <w:rPr>
+          <w:rFonts w:ascii="Arial" w:hAnsi="Arial" w:cs="Arial"/>
+          <w:sz w:val="24"/>
+          <w:szCs w:val="24"/>
+          <w:lang w:val="es-ES"/>
+        </w:rPr>
+        <w:t xml:space="preserve"> para incrustar el texto en la imagen. Aquí está el comando para incrustar el texto en la imagen:</w:t>
+      </w:r>
+    </w:p>
+    <w:p>
+      <w:pPr>
+        <w:pStyle w:val="Prrafodelista"/>
+        <w:numPr>
+          <w:ilvl w:val="2"/>
+          <w:numId w:val="1"/>
+        </w:numPr>
+        <w:rPr>
+          <w:rFonts w:ascii="Arial" w:hAnsi="Arial" w:cs="Arial"/>
+          <w:sz w:val="24"/>
+          <w:szCs w:val="24"/>
+          <w:lang w:val="es-ES"/>
+        </w:rPr>
+      </w:pPr>
+      <w:proofErr w:type="spellStart"/>
+      <w:r>
+        <w:rPr>
+          <w:rFonts w:ascii="Arial" w:hAnsi="Arial" w:cs="Arial"/>
+          <w:sz w:val="24"/>
+          <w:szCs w:val="24"/>
+          <w:lang w:val="es-ES"/>
+        </w:rPr>
+        <w:t>steghide</w:t>
+      </w:r>
+      <w:proofErr w:type="spellEnd"/>
+      <w:r>
+        <w:rPr>
+          <w:rFonts w:ascii="Arial" w:hAnsi="Arial" w:cs="Arial"/>
+          <w:sz w:val="24"/>
+          <w:szCs w:val="24"/>
+          <w:lang w:val="es-ES"/>
+        </w:rPr>
+        <w:t xml:space="preserve"> </w:t>
+      </w:r>
+      <w:proofErr w:type="spellStart"/>
+      <w:r>
+        <w:rPr>
+          <w:rFonts w:ascii="Arial" w:hAnsi="Arial" w:cs="Arial"/>
+          <w:sz w:val="24"/>
+          <w:szCs w:val="24"/>
+          <w:lang w:val="es-ES"/>
+        </w:rPr>
+        <w:t>embed</w:t>
+      </w:r>
+      <w:proofErr w:type="spellEnd"/>
+      <w:r>
+        <w:rPr>
+          <w:rFonts w:ascii="Arial" w:hAnsi="Arial" w:cs="Arial"/>
+          <w:sz w:val="24"/>
+          <w:szCs w:val="24"/>
+          <w:lang w:val="es-ES"/>
+        </w:rPr>
+        <w:t xml:space="preserve"> -</w:t>
+      </w:r>
+      <w:proofErr w:type="spellStart"/>
+      <w:r>
+        <w:rPr>
+          <w:rFonts w:ascii="Arial" w:hAnsi="Arial" w:cs="Arial"/>
+          <w:sz w:val="24"/>
+          <w:szCs w:val="24"/>
+          <w:lang w:val="es-ES"/>
+        </w:rPr>
+        <w:t>ef</w:t>
+      </w:r>
+      <w:proofErr w:type="spellEnd"/>
+      <w:r>
+        <w:rPr>
+          <w:rFonts w:ascii="Arial" w:hAnsi="Arial" w:cs="Arial"/>
+          <w:sz w:val="24"/>
+          <w:szCs w:val="24"/>
+          <w:lang w:val="es-ES"/>
+        </w:rPr>
+        <w:t xml:space="preserve"> mensaje.txt -</w:t>
+      </w:r>
+      <w:proofErr w:type="spellStart"/>
+      <w:r>
+        <w:rPr>
+          <w:rFonts w:ascii="Arial" w:hAnsi="Arial" w:cs="Arial"/>
+          <w:sz w:val="24"/>
+          <w:szCs w:val="24"/>
+          <w:lang w:val="es-ES"/>
+        </w:rPr>
+        <w:t>cf</w:t>
+      </w:r>
+      <w:proofErr w:type="spellEnd"/>
+      <w:r>
+        <w:rPr>
+          <w:rFonts w:ascii="Arial" w:hAnsi="Arial" w:cs="Arial"/>
+          <w:sz w:val="24"/>
+          <w:szCs w:val="24"/>
+          <w:lang w:val="es-ES"/>
+        </w:rPr>
+        <w:t xml:space="preserve"> imagen.jpg</w:t>
+      </w:r>
+    </w:p>
+    <w:p>
+      <w:pPr>
+        <w:pStyle w:val="Prrafodelista"/>
+        <w:numPr>
+          <w:ilvl w:val="2"/>
+          <w:numId w:val="1"/>
+        </w:numPr>
+        <w:rPr>
+          <w:rFonts w:ascii="Arial" w:hAnsi="Arial" w:cs="Arial"/>
+          <w:sz w:val="24"/>
+          <w:szCs w:val="24"/>
+          <w:lang w:val="es-ES"/>
+        </w:rPr>
+      </w:pPr>
+      <w:r>
+        <w:rPr>
+          <w:rFonts w:ascii="Arial" w:hAnsi="Arial" w:cs="Arial"/>
+          <w:sz w:val="24"/>
+          <w:szCs w:val="24"/>
+          <w:lang w:val="es-ES"/>
+        </w:rPr>
+        <w:t>Donde "mensaje.txt" es el archivo que contiene el texto que deseas incrustar y "imagen.jpg" es la imagen en la que deseas incrustarlo.</w:t>
+      </w:r>
+    </w:p>
+    <w:p>
+      <w:pPr>
+        <w:pStyle w:val="Prrafodelista"/>
+        <w:numPr>
+          <w:ilvl w:val="1"/>
+          <w:numId w:val="1"/>
+        </w:numPr>
+        <w:rPr>
+          <w:rFonts w:ascii="Arial" w:hAnsi="Arial" w:cs="Arial"/>
+          <w:sz w:val="24"/>
+          <w:szCs w:val="24"/>
+          <w:lang w:val="es-ES"/>
+        </w:rPr>
+      </w:pPr>
+      <w:r>
+        <w:rPr>
+          <w:rFonts w:ascii="Arial" w:hAnsi="Arial" w:cs="Arial"/>
+          <w:sz w:val="24"/>
+          <w:szCs w:val="24"/>
+          <w:lang w:val="es-ES"/>
+        </w:rPr>
+        <w:t>Extracción del texto incrustado:</w:t>
+      </w:r>
+    </w:p>
+    <w:p>
+      <w:pPr>
+        <w:pStyle w:val="Prrafodelista"/>
+        <w:numPr>
+          <w:ilvl w:val="2"/>
+          <w:numId w:val="1"/>
+        </w:numPr>
+        <w:rPr>
+          <w:rFonts w:ascii="Arial" w:hAnsi="Arial" w:cs="Arial"/>
+          <w:sz w:val="24"/>
+          <w:szCs w:val="24"/>
+          <w:lang w:val="es-ES"/>
+        </w:rPr>
+      </w:pPr>
+      <w:r>
+        <w:rPr>
+          <w:rFonts w:ascii="Arial" w:hAnsi="Arial" w:cs="Arial"/>
+          <w:sz w:val="24"/>
+          <w:szCs w:val="24"/>
+          <w:lang w:val="es-ES"/>
+        </w:rPr>
+        <w:t>Después de incrustar el texto en la imagen, necesitarás extraerlo nuevamente para compararlo con el original. Puedes hacer esto con el siguiente comando:</w:t>
+      </w:r>
+    </w:p>
+    <w:p>
+      <w:pPr>
+        <w:pStyle w:val="Prrafodelista"/>
+        <w:numPr>
+          <w:ilvl w:val="2"/>
+          <w:numId w:val="1"/>
+        </w:numPr>
+        <w:rPr>
+          <w:rFonts w:ascii="Arial" w:hAnsi="Arial" w:cs="Arial"/>
+          <w:sz w:val="24"/>
+          <w:szCs w:val="24"/>
+          <w:lang w:val="es-ES"/>
+        </w:rPr>
+      </w:pPr>
+      <w:proofErr w:type="spellStart"/>
+      <w:r>
+        <w:rPr>
+          <w:rFonts w:ascii="Arial" w:hAnsi="Arial" w:cs="Arial"/>
+          <w:sz w:val="24"/>
+          <w:szCs w:val="24"/>
+          <w:lang w:val="es-ES"/>
+        </w:rPr>
+        <w:t>steghide</w:t>
+      </w:r>
+      <w:proofErr w:type="spellEnd"/>
+      <w:r>
+        <w:rPr>
+          <w:rFonts w:ascii="Arial" w:hAnsi="Arial" w:cs="Arial"/>
+          <w:sz w:val="24"/>
+          <w:szCs w:val="24"/>
+          <w:lang w:val="es-ES"/>
+        </w:rPr>
+        <w:t xml:space="preserve"> </w:t>
+      </w:r>
+      <w:proofErr w:type="spellStart"/>
+      <w:r>
+        <w:rPr>
+          <w:rFonts w:ascii="Arial" w:hAnsi="Arial" w:cs="Arial"/>
+          <w:sz w:val="24"/>
+          <w:szCs w:val="24"/>
+          <w:lang w:val="es-ES"/>
+        </w:rPr>
+        <w:t>extract</w:t>
+      </w:r>
+      <w:proofErr w:type="spellEnd"/>
+      <w:r>
+        <w:rPr>
+          <w:rFonts w:ascii="Arial" w:hAnsi="Arial" w:cs="Arial"/>
+          <w:sz w:val="24"/>
+          <w:szCs w:val="24"/>
+          <w:lang w:val="es-ES"/>
+        </w:rPr>
+        <w:t xml:space="preserve"> -</w:t>
+      </w:r>
+      <w:proofErr w:type="spellStart"/>
+      <w:r>
+        <w:rPr>
+          <w:rFonts w:ascii="Arial" w:hAnsi="Arial" w:cs="Arial"/>
+          <w:sz w:val="24"/>
+          <w:szCs w:val="24"/>
+          <w:lang w:val="es-ES"/>
+        </w:rPr>
+        <w:t>sf</w:t>
+      </w:r>
+      <w:proofErr w:type="spellEnd"/>
+      <w:r>
+        <w:rPr>
+          <w:rFonts w:ascii="Arial" w:hAnsi="Arial" w:cs="Arial"/>
+          <w:sz w:val="24"/>
+          <w:szCs w:val="24"/>
+          <w:lang w:val="es-ES"/>
+        </w:rPr>
+        <w:t xml:space="preserve"> imagen.jpg</w:t>
+      </w:r>
+    </w:p>
+    <w:p>
+      <w:pPr>
+        <w:pStyle w:val="Prrafodelista"/>
+        <w:numPr>
+          <w:ilvl w:val="1"/>
+          <w:numId w:val="1"/>
+        </w:numPr>
+        <w:rPr>
+          <w:rFonts w:ascii="Arial" w:hAnsi="Arial" w:cs="Arial"/>
+          <w:sz w:val="24"/>
+          <w:szCs w:val="24"/>
+          <w:lang w:val="es-ES"/>
+        </w:rPr>
+      </w:pPr>
+      <w:proofErr w:type="spellStart"/>
+      <w:r>
+        <w:rPr>
+          <w:rFonts w:ascii="Arial" w:hAnsi="Arial" w:cs="Arial"/>
+          <w:sz w:val="24"/>
+          <w:szCs w:val="24"/>
+          <w:lang w:val="es-ES"/>
+        </w:rPr>
+        <w:t>Hashing</w:t>
+      </w:r>
+      <w:proofErr w:type="spellEnd"/>
+      <w:r>
+        <w:rPr>
+          <w:rFonts w:ascii="Arial" w:hAnsi="Arial" w:cs="Arial"/>
+          <w:sz w:val="24"/>
+          <w:szCs w:val="24"/>
+          <w:lang w:val="es-ES"/>
+        </w:rPr>
+        <w:t xml:space="preserve"> del texto original y del texto extraído:</w:t>
+      </w:r>
+    </w:p>
+    <w:p>
+      <w:pPr>
+        <w:pStyle w:val="Prrafodelista"/>
+        <w:numPr>
+          <w:ilvl w:val="2"/>
+          <w:numId w:val="1"/>
+        </w:numPr>
+        <w:rPr>
+          <w:rFonts w:ascii="Arial" w:hAnsi="Arial" w:cs="Arial"/>
+          <w:sz w:val="24"/>
+          <w:szCs w:val="24"/>
+          <w:lang w:val="es-ES"/>
+        </w:rPr>
+      </w:pPr>
+      <w:r>
+        <w:rPr>
+          <w:rFonts w:ascii="Arial" w:hAnsi="Arial" w:cs="Arial"/>
+          <w:sz w:val="24"/>
+          <w:szCs w:val="24"/>
+          <w:lang w:val="es-ES"/>
+        </w:rPr>
+        <w:t>Calcula el hash del texto original que deseas incrustar en la imagen.</w:t>
+      </w:r>
+    </w:p>
+    <w:p>
+      <w:pPr>
+        <w:pStyle w:val="Prrafodelista"/>
+        <w:numPr>
+          <w:ilvl w:val="2"/>
+          <w:numId w:val="1"/>
+        </w:numPr>
+        <w:rPr>
+          <w:rFonts w:ascii="Arial" w:hAnsi="Arial" w:cs="Arial"/>
+          <w:sz w:val="24"/>
+          <w:szCs w:val="24"/>
+          <w:lang w:val="es-ES"/>
+        </w:rPr>
+      </w:pPr>
+      <w:r>
+        <w:rPr>
+          <w:rFonts w:ascii="Arial" w:hAnsi="Arial" w:cs="Arial"/>
+          <w:sz w:val="24"/>
+          <w:szCs w:val="24"/>
+          <w:lang w:val="es-ES"/>
+        </w:rPr>
+        <w:t>Calcula el hash del texto extraído de la imagen después de la incrustación.</w:t>
+      </w:r>
+    </w:p>
+    <w:p>
+      <w:pPr>
+        <w:pStyle w:val="Prrafodelista"/>
+        <w:numPr>
+          <w:ilvl w:val="1"/>
+          <w:numId w:val="1"/>
+        </w:numPr>
+        <w:rPr>
+          <w:rFonts w:ascii="Arial" w:hAnsi="Arial" w:cs="Arial"/>
+          <w:sz w:val="24"/>
+          <w:szCs w:val="24"/>
+          <w:lang w:val="es-ES"/>
+        </w:rPr>
+      </w:pPr>
+      <w:r>
+        <w:rPr>
+          <w:rFonts w:ascii="Arial" w:hAnsi="Arial" w:cs="Arial"/>
+          <w:sz w:val="24"/>
+          <w:szCs w:val="24"/>
+          <w:lang w:val="es-ES"/>
+        </w:rPr>
+        <w:t>Comparación de los hashes:</w:t>
+      </w:r>
+    </w:p>
+    <w:p>
+      <w:pPr>
+        <w:pStyle w:val="Prrafodelista"/>
+        <w:numPr>
+          <w:ilvl w:val="2"/>
+          <w:numId w:val="1"/>
+        </w:numPr>
+        <w:rPr>
+          <w:rFonts w:ascii="Arial" w:hAnsi="Arial" w:cs="Arial"/>
+          <w:sz w:val="24"/>
+          <w:szCs w:val="24"/>
+          <w:lang w:val="es-ES"/>
+        </w:rPr>
+      </w:pPr>
+      <w:r>
+        <w:rPr>
+          <w:rFonts w:ascii="Arial" w:hAnsi="Arial" w:cs="Arial"/>
+          <w:sz w:val="24"/>
+          <w:szCs w:val="24"/>
+          <w:lang w:val="es-ES"/>
+        </w:rPr>
+        <w:t>Compara los hashes del texto original y del texto extraído. Si los hashes coinciden, significa que el texto incrustado se extrajo correctamente de la imagen.</w:t>
+      </w:r>
+    </w:p>
+    <w:p>
+      <w:pPr>
+        <w:rPr>
+          <w:rFonts w:ascii="Arial" w:hAnsi="Arial" w:cs="Arial"/>
+          <w:sz w:val="24"/>
+          <w:szCs w:val="24"/>
+          <w:lang w:val="es-ES"/>
+        </w:rPr>
+      </w:pPr>
+    </w:p>
     <w:sectPr>
       <w:pgSz w:w="12240" w:h="15840"/>
       <w:pgMar w:top="1417" w:right="1701" w:bottom="851" w:left="1701" w:header="708" w:footer="708" w:gutter="0"/>
@@ -2402,7 +4028,7 @@
         <w:ind w:left="2160" w:hanging="180"/>
       </w:pPr>
     </w:lvl>
-    <w:lvl w:ilvl="3" w:tplc="240A000F" w:tentative="1">
+    <w:lvl w:ilvl="3" w:tplc="240A000F">
       <w:start w:val="1"/>
       <w:numFmt w:val="decimal"/>
       <w:lvlText w:val="%4."/>

</xml_diff>